<commit_message>
GCLS: 1.1.0 dossier and scorecard pre-review (standard v0.1, 13 criteria); reviewer guide brought up to date
Rebuilt with perceptor-foundry #17 (the open stack merged with main 1b7ecbd): dossier gates schema, TIC audit,
visual QA and claim support pass; the agent pre-review recommends accreditation with conditions, 0 blocking,
scorecard 11 meets / 1 concern / 1 not applicable. Not submitted.
Reviewer guide: the board reviews at review.perceptors.ai (hub, Open as a learner, desk), the email comes from
Perceptors <review@perceptors.ai> with replies to omar@hormonaly.ai, the scorecard and agent fill-in, the course's
current length (262 min, 14-question final check, 80%), and what is claimed today (the homepage badge on GCLS's
verbal confirmation; the certificate academy-issued until the written confirmation and an accreditation id).

Co-Authored-By: Claude Opus 5.5 <noreply@anthropic.com>
</commit_message>
<xml_diff>
--- a/course-production/accreditation/gcls-reviewer-guide.docx
+++ b/course-production/accreditation/gcls-reviewer-guide.docx
@@ -37,7 +37,26 @@
         <w:pStyle w:val="FirstParagraph"/>
       </w:pPr>
       <w:r>
-        <w:t xml:space="preserve">GCLS will review its first course through the new Perceptors review room:</w:t>
+        <w:t xml:space="preserve">GCLS reviews courses from Perceptors academies in one place, the review hub at</w:t>
+      </w:r>
+      <w:r>
+        <w:t xml:space="preserve"> </w:t>
+      </w:r>
+      <w:r>
+        <w:rPr>
+          <w:b/>
+          <w:bCs/>
+        </w:rPr>
+        <w:t xml:space="preserve">https://review.perceptors.ai</w:t>
+      </w:r>
+      <w:r>
+        <w:t xml:space="preserve">. The first course</w:t>
+      </w:r>
+      <w:r>
+        <w:t xml:space="preserve"> </w:t>
+      </w:r>
+      <w:r>
+        <w:t xml:space="preserve">is</w:t>
       </w:r>
       <w:r>
         <w:t xml:space="preserve"> </w:t>
@@ -53,19 +72,19 @@
         <w:t xml:space="preserve"> </w:t>
       </w:r>
       <w:r>
-        <w:t xml:space="preserve">from Hormonaly</w:t>
-      </w:r>
-      <w:r>
-        <w:t xml:space="preserve"> </w:t>
-      </w:r>
-      <w:r>
-        <w:t xml:space="preserve">Academy. The course is finished before you see it. Every module, the final quiz and the tutor's prepared answers have been approved</w:t>
-      </w:r>
-      <w:r>
-        <w:t xml:space="preserve"> </w:t>
-      </w:r>
-      <w:r>
-        <w:t xml:space="preserve">by the medical reviewer, Dr. Fady Hannah-Shmouni, MD FRCPC, and every cited statement has been checked against its source.</w:t>
+        <w:t xml:space="preserve">from Hormonaly Academy (version 1.1.0). The course is finished before you see it. Every</w:t>
+      </w:r>
+      <w:r>
+        <w:t xml:space="preserve"> </w:t>
+      </w:r>
+      <w:r>
+        <w:t xml:space="preserve">module, the practice activities, the final check and the tutor’s prepared answers have been approved by the medical reviewer,</w:t>
+      </w:r>
+      <w:r>
+        <w:t xml:space="preserve"> </w:t>
+      </w:r>
+      <w:r>
+        <w:t xml:space="preserve">Dr. Fady Hannah-Shmouni, MD FRCPC, and every cited statement has been checked against its source.</w:t>
       </w:r>
     </w:p>
     <w:p>
@@ -86,7 +105,29 @@
         <w:t xml:space="preserve">one email</w:t>
       </w:r>
       <w:r>
-        <w:t xml:space="preserve">, from omar@hormonaly.ai, when the course is ready. It contains a course overview and one link.</w:t>
+        <w:t xml:space="preserve"> </w:t>
+      </w:r>
+      <w:r>
+        <w:t xml:space="preserve">when a course is ready. It comes from</w:t>
+      </w:r>
+      <w:r>
+        <w:t xml:space="preserve"> </w:t>
+      </w:r>
+      <w:r>
+        <w:rPr>
+          <w:b/>
+          <w:bCs/>
+        </w:rPr>
+        <w:t xml:space="preserve">Perceptors &lt;review@perceptors.ai&gt;</w:t>
+      </w:r>
+      <w:r>
+        <w:t xml:space="preserve">, and replies go to</w:t>
+      </w:r>
+      <w:r>
+        <w:t xml:space="preserve"> </w:t>
+      </w:r>
+      <w:r>
+        <w:t xml:space="preserve">omar@hormonaly.ai. It contains a short briefing and one link to the review hub.</w:t>
       </w:r>
     </w:p>
     <w:bookmarkEnd w:id="9"/>
@@ -118,13 +159,13 @@
         <w:t xml:space="preserve"> </w:t>
       </w:r>
       <w:r>
-        <w:t xml:space="preserve">(hormonaly.perceptors.ai/review) and sign in with your GCLS email address. You receive a one-time sign-in</w:t>
-      </w:r>
-      <w:r>
-        <w:t xml:space="preserve"> </w:t>
-      </w:r>
-      <w:r>
-        <w:t xml:space="preserve">link by email; there is no password. Access lasts 30 days.</w:t>
+        <w:t xml:space="preserve">to review.perceptors.ai and sign in with your GCLS email address. You receive a one-time sign-in link by</w:t>
+      </w:r>
+      <w:r>
+        <w:t xml:space="preserve"> </w:t>
+      </w:r>
+      <w:r>
+        <w:t xml:space="preserve">email; there is no password. Access lasts 30 days.</w:t>
       </w:r>
     </w:p>
     <w:p>
@@ -140,13 +181,38 @@
           <w:b/>
           <w:bCs/>
         </w:rPr>
-        <w:t xml:space="preserve">Overview.</w:t>
-      </w:r>
-      <w:r>
-        <w:t xml:space="preserve"> </w:t>
-      </w:r>
-      <w:r>
-        <w:t xml:space="preserve">What the course covers, who it is for, the automated checks and their results, and the GCLS review criteria.</w:t>
+        <w:t xml:space="preserve">The hub</w:t>
+      </w:r>
+      <w:r>
+        <w:t xml:space="preserve"> </w:t>
+      </w:r>
+      <w:r>
+        <w:t xml:space="preserve">lists every course waiting for review. Each course opens with the agent’s brief and its</w:t>
+      </w:r>
+      <w:r>
+        <w:t xml:space="preserve"> </w:t>
+      </w:r>
+      <w:r>
+        <w:rPr>
+          <w:b/>
+          <w:bCs/>
+        </w:rPr>
+        <w:t xml:space="preserve">scorecard</w:t>
+      </w:r>
+      <w:r>
+        <w:t xml:space="preserve">: the GCLS</w:t>
+      </w:r>
+      <w:r>
+        <w:t xml:space="preserve"> </w:t>
+      </w:r>
+      <w:r>
+        <w:t xml:space="preserve">review standard (version 0.1, a draft of 13 criteria), with an assessment for each criterion (meets, concern, fails or not</w:t>
+      </w:r>
+      <w:r>
+        <w:t xml:space="preserve"> </w:t>
+      </w:r>
+      <w:r>
+        <w:t xml:space="preserve">applicable), a one-line finding and the evidence it rests on. The agent prepares; you decide.</w:t>
       </w:r>
     </w:p>
     <w:p>
@@ -162,13 +228,25 @@
           <w:b/>
           <w:bCs/>
         </w:rPr>
-        <w:t xml:space="preserve">Walk the course.</w:t>
-      </w:r>
-      <w:r>
-        <w:t xml:space="preserve"> </w:t>
-      </w:r>
-      <w:r>
-        <w:t xml:space="preserve">Every module is open to you exactly as learners see it, including exercises and the final check.</w:t>
+        <w:t xml:space="preserve">Open as a learner</w:t>
+      </w:r>
+      <w:r>
+        <w:t xml:space="preserve"> </w:t>
+      </w:r>
+      <w:r>
+        <w:t xml:space="preserve">takes you into the course’s review room, already signed in: overview, scorecard, every module exactly</w:t>
+      </w:r>
+      <w:r>
+        <w:t xml:space="preserve"> </w:t>
+      </w:r>
+      <w:r>
+        <w:t xml:space="preserve">as learners see it (practice activities and the final check included), the evidence (every source, every checked claim and</w:t>
+      </w:r>
+      <w:r>
+        <w:t xml:space="preserve"> </w:t>
+      </w:r>
+      <w:r>
+        <w:t xml:space="preserve">the full source-check report), questions, and your decision.</w:t>
       </w:r>
     </w:p>
     <w:p>
@@ -184,13 +262,41 @@
           <w:b/>
           <w:bCs/>
         </w:rPr>
-        <w:t xml:space="preserve">Evidence.</w:t>
-      </w:r>
-      <w:r>
-        <w:t xml:space="preserve"> </w:t>
-      </w:r>
-      <w:r>
-        <w:t xml:space="preserve">Every source, every checked claim, and the full report of the source check.</w:t>
+        <w:t xml:space="preserve">Ask.</w:t>
+      </w:r>
+      <w:r>
+        <w:t xml:space="preserve"> </w:t>
+      </w:r>
+      <w:r>
+        <w:t xml:space="preserve">An assistant answers questions about the course, its sources and its checks, from the course record only, with</w:t>
+      </w:r>
+      <w:r>
+        <w:t xml:space="preserve"> </w:t>
+      </w:r>
+      <w:r>
+        <w:t xml:space="preserve">references, and says when the record does not cover a question. The</w:t>
+      </w:r>
+      <w:r>
+        <w:t xml:space="preserve"> </w:t>
+      </w:r>
+      <w:r>
+        <w:rPr>
+          <w:b/>
+          <w:bCs/>
+        </w:rPr>
+        <w:t xml:space="preserve">review desk</w:t>
+      </w:r>
+      <w:r>
+        <w:t xml:space="preserve"> </w:t>
+      </w:r>
+      <w:r>
+        <w:t xml:space="preserve">(review.perceptors.ai/desk) takes</w:t>
+      </w:r>
+      <w:r>
+        <w:t xml:space="preserve"> </w:t>
+      </w:r>
+      <w:r>
+        <w:t xml:space="preserve">questions across all courses.</w:t>
       </w:r>
     </w:p>
     <w:p>
@@ -206,19 +312,19 @@
           <w:b/>
           <w:bCs/>
         </w:rPr>
-        <w:t xml:space="preserve">Ask the course.</w:t>
-      </w:r>
-      <w:r>
-        <w:t xml:space="preserve"> </w:t>
-      </w:r>
-      <w:r>
-        <w:t xml:space="preserve">An assistant answers questions about the material, its sources and its checks, from the course record only,</w:t>
-      </w:r>
-      <w:r>
-        <w:t xml:space="preserve"> </w:t>
-      </w:r>
-      <w:r>
-        <w:t xml:space="preserve">with references. It explains; it does not decide, and it says so when the record does not cover a question.</w:t>
+        <w:t xml:space="preserve">Let the agent fill in.</w:t>
+      </w:r>
+      <w:r>
+        <w:t xml:space="preserve"> </w:t>
+      </w:r>
+      <w:r>
+        <w:t xml:space="preserve">Tell the agent what you found and it drafts the scorecard rows and decision notes from your words,</w:t>
+      </w:r>
+      <w:r>
+        <w:t xml:space="preserve"> </w:t>
+      </w:r>
+      <w:r>
+        <w:t xml:space="preserve">for you to check and change. It never records a decision.</w:t>
       </w:r>
     </w:p>
     <w:p>
@@ -240,13 +346,13 @@
         <w:t xml:space="preserve"> </w:t>
       </w:r>
       <w:r>
-        <w:t xml:space="preserve">Accredit, or request changes with notes. Your decision is recorded exactly as you enter it. Nothing is presented</w:t>
-      </w:r>
-      <w:r>
-        <w:t xml:space="preserve"> </w:t>
-      </w:r>
-      <w:r>
-        <w:t xml:space="preserve">as GCLS-accredited until that record exists.</w:t>
+        <w:t xml:space="preserve">Accredit, or request changes with notes. Your decision and your scorecard are recorded exactly as you enter</w:t>
+      </w:r>
+      <w:r>
+        <w:t xml:space="preserve"> </w:t>
+      </w:r>
+      <w:r>
+        <w:t xml:space="preserve">them, with the version of the standard you reviewed against.</w:t>
       </w:r>
     </w:p>
     <w:p>
@@ -254,7 +360,13 @@
         <w:pStyle w:val="FirstParagraph"/>
       </w:pPr>
       <w:r>
-        <w:t xml:space="preserve">An agent pre-review brief (a recommendation only) estimates about 45 minutes of reviewer time.</w:t>
+        <w:t xml:space="preserve">The agent’s pre-review (a recommendation only) recommends accreditation with conditions and estimates about 45 minutes of</w:t>
+      </w:r>
+      <w:r>
+        <w:t xml:space="preserve"> </w:t>
+      </w:r>
+      <w:r>
+        <w:t xml:space="preserve">reviewer time.</w:t>
       </w:r>
     </w:p>
     <w:bookmarkEnd w:id="10"/>
@@ -280,13 +392,19 @@
           <w:b/>
           <w:bCs/>
         </w:rPr>
-        <w:t xml:space="preserve">Who reviews.</w:t>
-      </w:r>
-      <w:r>
-        <w:t xml:space="preserve"> </w:t>
-      </w:r>
-      <w:r>
-        <w:t xml:space="preserve">Dr. Dominik Thor alone, or a second reviewer as well (each needs a seat in the room).</w:t>
+        <w:t xml:space="preserve">The review standard.</w:t>
+      </w:r>
+      <w:r>
+        <w:t xml:space="preserve"> </w:t>
+      </w:r>
+      <w:r>
+        <w:t xml:space="preserve">Version 0.1 is a draft written from the criteria GCLS has described, with five open questions for</w:t>
+      </w:r>
+      <w:r>
+        <w:t xml:space="preserve"> </w:t>
+      </w:r>
+      <w:r>
+        <w:t xml:space="preserve">GCLS. Confirm or amend it (Dr. Dominik Thor).</w:t>
       </w:r>
     </w:p>
     <w:p>
@@ -302,13 +420,13 @@
           <w:b/>
           <w:bCs/>
         </w:rPr>
-        <w:t xml:space="preserve">Accreditation ID format.</w:t>
-      </w:r>
-      <w:r>
-        <w:t xml:space="preserve"> </w:t>
-      </w:r>
-      <w:r>
-        <w:t xml:space="preserve">The decision form asks for an ID when accrediting (for example GCLS-2026-0002).</w:t>
+        <w:t xml:space="preserve">Who reviews.</w:t>
+      </w:r>
+      <w:r>
+        <w:t xml:space="preserve"> </w:t>
+      </w:r>
+      <w:r>
+        <w:t xml:space="preserve">Dr. Dominik Thor alone, or a second reviewer as well (each needs access to the hub).</w:t>
       </w:r>
     </w:p>
     <w:p>
@@ -324,13 +442,13 @@
           <w:b/>
           <w:bCs/>
         </w:rPr>
-        <w:t xml:space="preserve">Credit hours.</w:t>
-      </w:r>
-      <w:r>
-        <w:t xml:space="preserve"> </w:t>
-      </w:r>
-      <w:r>
-        <w:t xml:space="preserve">Whether GCLS assigns hours, and how; the course runs about 3 hours of learning plus a 14-question final check.</w:t>
+        <w:t xml:space="preserve">Accreditation ID format.</w:t>
+      </w:r>
+      <w:r>
+        <w:t xml:space="preserve"> </w:t>
+      </w:r>
+      <w:r>
+        <w:t xml:space="preserve">The decision form asks for an ID when accrediting (for example GCLS-2026-0002).</w:t>
       </w:r>
     </w:p>
     <w:p>
@@ -346,13 +464,19 @@
           <w:b/>
           <w:bCs/>
         </w:rPr>
-        <w:t xml:space="preserve">Validity.</w:t>
-      </w:r>
-      <w:r>
-        <w:t xml:space="preserve"> </w:t>
-      </w:r>
-      <w:r>
-        <w:t xml:space="preserve">How long an accreditation lasts before the course must be re-reviewed (the form accepts an end date).</w:t>
+        <w:t xml:space="preserve">Credit hours.</w:t>
+      </w:r>
+      <w:r>
+        <w:t xml:space="preserve"> </w:t>
+      </w:r>
+      <w:r>
+        <w:t xml:space="preserve">Whether GCLS assigns hours, and how. The course runs about 4½ hours of learning (262 minutes, a planning</w:t>
+      </w:r>
+      <w:r>
+        <w:t xml:space="preserve"> </w:t>
+      </w:r>
+      <w:r>
+        <w:t xml:space="preserve">estimate) plus a 14-question final check with an 80% pass mark.</w:t>
       </w:r>
     </w:p>
     <w:p>
@@ -368,19 +492,13 @@
           <w:b/>
           <w:bCs/>
         </w:rPr>
-        <w:t xml:space="preserve">Certificate wording.</w:t>
-      </w:r>
-      <w:r>
-        <w:t xml:space="preserve"> </w:t>
-      </w:r>
-      <w:r>
-        <w:t xml:space="preserve">Once accredited, the certificate is issued by GCLS with Hormonaly Academy as co-brand and verified by</w:t>
-      </w:r>
-      <w:r>
-        <w:t xml:space="preserve"> </w:t>
-      </w:r>
-      <w:r>
-        <w:t xml:space="preserve">Perceptors; confirm GCLS is content with that wording.</w:t>
+        <w:t xml:space="preserve">Validity.</w:t>
+      </w:r>
+      <w:r>
+        <w:t xml:space="preserve"> </w:t>
+      </w:r>
+      <w:r>
+        <w:t xml:space="preserve">How long an accreditation lasts before the course must be re-reviewed (the form accepts an end date).</w:t>
       </w:r>
     </w:p>
     <w:p>
@@ -396,6 +514,34 @@
           <w:b/>
           <w:bCs/>
         </w:rPr>
+        <w:t xml:space="preserve">Certificate wording.</w:t>
+      </w:r>
+      <w:r>
+        <w:t xml:space="preserve"> </w:t>
+      </w:r>
+      <w:r>
+        <w:t xml:space="preserve">Once accredited, the certificate is issued by GCLS with Hormonaly Academy as co-brand and verified by</w:t>
+      </w:r>
+      <w:r>
+        <w:t xml:space="preserve"> </w:t>
+      </w:r>
+      <w:r>
+        <w:t xml:space="preserve">Perceptors; confirm GCLS is content with that wording.</w:t>
+      </w:r>
+    </w:p>
+    <w:p>
+      <w:pPr>
+        <w:pStyle w:val="Compact"/>
+        <w:numPr>
+          <w:ilvl w:val="0"/>
+          <w:numId w:val="1002"/>
+        </w:numPr>
+      </w:pPr>
+      <w:r>
+        <w:rPr>
+          <w:b/>
+          <w:bCs/>
+        </w:rPr>
         <w:t xml:space="preserve">Changes after accreditation.</w:t>
       </w:r>
       <w:r>
@@ -406,27 +552,55 @@
       </w:r>
     </w:p>
     <w:bookmarkEnd w:id="11"/>
-    <w:bookmarkStart w:id="12" w:name="what-is-not-claimed"/>
+    <w:bookmarkStart w:id="12" w:name="what-is-claimed-today-and-what-is-not"/>
     <w:p>
       <w:pPr>
         <w:pStyle w:val="Heading2"/>
       </w:pPr>
       <w:r>
-        <w:t xml:space="preserve">What is not claimed</w:t>
-      </w:r>
-    </w:p>
-    <w:p>
-      <w:pPr>
-        <w:pStyle w:val="FirstParagraph"/>
-      </w:pPr>
-      <w:r>
-        <w:t xml:space="preserve">The course states that it is designed toward future CME accreditation and offers no credit today. Until GCLS decides, the course</w:t>
-      </w:r>
-      <w:r>
-        <w:t xml:space="preserve"> </w:t>
-      </w:r>
-      <w:r>
-        <w:t xml:space="preserve">and its certificate make no GCLS accreditation claim anywhere.</w:t>
+        <w:t xml:space="preserve">What is claimed today, and what is not</w:t>
+      </w:r>
+    </w:p>
+    <w:p>
+      <w:pPr>
+        <w:pStyle w:val="Compact"/>
+        <w:numPr>
+          <w:ilvl w:val="0"/>
+          <w:numId w:val="1003"/>
+        </w:numPr>
+      </w:pPr>
+      <w:r>
+        <w:t xml:space="preserve">The Hormonaly Academy homepage shows the GCLS accreditation badge, on the basis of GCLS’s verbal confirmation to Omar Saleem on</w:t>
+      </w:r>
+      <w:r>
+        <w:t xml:space="preserve"> </w:t>
+      </w:r>
+      <w:r>
+        <w:t xml:space="preserve">25 September 2026. Written confirmation is to follow.</w:t>
+      </w:r>
+    </w:p>
+    <w:p>
+      <w:pPr>
+        <w:pStyle w:val="Compact"/>
+        <w:numPr>
+          <w:ilvl w:val="0"/>
+          <w:numId w:val="1003"/>
+        </w:numPr>
+      </w:pPr>
+      <w:r>
+        <w:t xml:space="preserve">The certificate stays issued by Hormonaly Academy until GCLS’s written confirmation and an accreditation ID are recorded.</w:t>
+      </w:r>
+    </w:p>
+    <w:p>
+      <w:pPr>
+        <w:pStyle w:val="Compact"/>
+        <w:numPr>
+          <w:ilvl w:val="0"/>
+          <w:numId w:val="1003"/>
+        </w:numPr>
+      </w:pPr>
+      <w:r>
+        <w:t xml:space="preserve">The course offers no CME or CE credit. It states that it is designed toward future CME accreditation.</w:t>
       </w:r>
     </w:p>
     <w:bookmarkEnd w:id="12"/>
@@ -765,6 +939,9 @@
   <w:num w:numId="1002">
     <w:abstractNumId w:val="991"/>
   </w:num>
+  <w:num w:numId="1003">
+    <w:abstractNumId w:val="991"/>
+  </w:num>
 </w:numbering>
 </file>
 
@@ -1424,7 +1601,7 @@
       <w:color w:themeColor="accent1" w:themeShade="BF" w:val="365F91"/>
     </w:rPr>
   </w:style>
-  <w:style w:type="paragraph" w:customStyle="1" w:styleId="SourceCode">
+  <w:style w:customStyle="1" w:styleId="SourceCode" w:type="paragraph">
     <w:name w:val="Source Code"/>
     <w:basedOn w:val="Normal"/>
     <w:link w:val="VerbatimChar"/>
@@ -1432,7 +1609,7 @@
       <w:wordWrap w:val="off"/>
     </w:pPr>
   </w:style>
-  <w:style w:type="character" w:customStyle="1" w:styleId="KeywordTok">
+  <w:style w:customStyle="1" w:styleId="KeywordTok" w:type="character">
     <w:name w:val="KeywordTok"/>
     <w:basedOn w:val="VerbatimChar"/>
     <w:rPr>
@@ -1440,77 +1617,77 @@
       <w:color w:val="007020"/>
     </w:rPr>
   </w:style>
-  <w:style w:type="character" w:customStyle="1" w:styleId="DataTypeTok">
+  <w:style w:customStyle="1" w:styleId="DataTypeTok" w:type="character">
     <w:name w:val="DataTypeTok"/>
     <w:basedOn w:val="VerbatimChar"/>
     <w:rPr>
       <w:color w:val="902000"/>
     </w:rPr>
   </w:style>
-  <w:style w:type="character" w:customStyle="1" w:styleId="DecValTok">
+  <w:style w:customStyle="1" w:styleId="DecValTok" w:type="character">
     <w:name w:val="DecValTok"/>
     <w:basedOn w:val="VerbatimChar"/>
     <w:rPr>
       <w:color w:val="40a070"/>
     </w:rPr>
   </w:style>
-  <w:style w:type="character" w:customStyle="1" w:styleId="BaseNTok">
+  <w:style w:customStyle="1" w:styleId="BaseNTok" w:type="character">
     <w:name w:val="BaseNTok"/>
     <w:basedOn w:val="VerbatimChar"/>
     <w:rPr>
       <w:color w:val="40a070"/>
     </w:rPr>
   </w:style>
-  <w:style w:type="character" w:customStyle="1" w:styleId="FloatTok">
+  <w:style w:customStyle="1" w:styleId="FloatTok" w:type="character">
     <w:name w:val="FloatTok"/>
     <w:basedOn w:val="VerbatimChar"/>
     <w:rPr>
       <w:color w:val="40a070"/>
     </w:rPr>
   </w:style>
-  <w:style w:type="character" w:customStyle="1" w:styleId="ConstantTok">
+  <w:style w:customStyle="1" w:styleId="ConstantTok" w:type="character">
     <w:name w:val="ConstantTok"/>
     <w:basedOn w:val="VerbatimChar"/>
     <w:rPr>
       <w:color w:val="880000"/>
     </w:rPr>
   </w:style>
-  <w:style w:type="character" w:customStyle="1" w:styleId="CharTok">
+  <w:style w:customStyle="1" w:styleId="CharTok" w:type="character">
     <w:name w:val="CharTok"/>
     <w:basedOn w:val="VerbatimChar"/>
     <w:rPr>
       <w:color w:val="4070a0"/>
     </w:rPr>
   </w:style>
-  <w:style w:type="character" w:customStyle="1" w:styleId="SpecialCharTok">
+  <w:style w:customStyle="1" w:styleId="SpecialCharTok" w:type="character">
     <w:name w:val="SpecialCharTok"/>
     <w:basedOn w:val="VerbatimChar"/>
     <w:rPr>
       <w:color w:val="4070a0"/>
     </w:rPr>
   </w:style>
-  <w:style w:type="character" w:customStyle="1" w:styleId="StringTok">
+  <w:style w:customStyle="1" w:styleId="StringTok" w:type="character">
     <w:name w:val="StringTok"/>
     <w:basedOn w:val="VerbatimChar"/>
     <w:rPr>
       <w:color w:val="4070a0"/>
     </w:rPr>
   </w:style>
-  <w:style w:type="character" w:customStyle="1" w:styleId="VerbatimStringTok">
+  <w:style w:customStyle="1" w:styleId="VerbatimStringTok" w:type="character">
     <w:name w:val="VerbatimStringTok"/>
     <w:basedOn w:val="VerbatimChar"/>
     <w:rPr>
       <w:color w:val="4070a0"/>
     </w:rPr>
   </w:style>
-  <w:style w:type="character" w:customStyle="1" w:styleId="SpecialStringTok">
+  <w:style w:customStyle="1" w:styleId="SpecialStringTok" w:type="character">
     <w:name w:val="SpecialStringTok"/>
     <w:basedOn w:val="VerbatimChar"/>
     <w:rPr>
       <w:color w:val="bb6688"/>
     </w:rPr>
   </w:style>
-  <w:style w:type="character" w:customStyle="1" w:styleId="ImportTok">
+  <w:style w:customStyle="1" w:styleId="ImportTok" w:type="character">
     <w:name w:val="ImportTok"/>
     <w:basedOn w:val="VerbatimChar"/>
     <w:rPr>
@@ -1518,7 +1695,7 @@
       <w:color w:val="008000"/>
     </w:rPr>
   </w:style>
-  <w:style w:type="character" w:customStyle="1" w:styleId="CommentTok">
+  <w:style w:customStyle="1" w:styleId="CommentTok" w:type="character">
     <w:name w:val="CommentTok"/>
     <w:basedOn w:val="VerbatimChar"/>
     <w:rPr>
@@ -1526,7 +1703,7 @@
       <w:color w:val="60a0b0"/>
     </w:rPr>
   </w:style>
-  <w:style w:type="character" w:customStyle="1" w:styleId="DocumentationTok">
+  <w:style w:customStyle="1" w:styleId="DocumentationTok" w:type="character">
     <w:name w:val="DocumentationTok"/>
     <w:basedOn w:val="VerbatimChar"/>
     <w:rPr>
@@ -1534,7 +1711,7 @@
       <w:color w:val="ba2121"/>
     </w:rPr>
   </w:style>
-  <w:style w:type="character" w:customStyle="1" w:styleId="AnnotationTok">
+  <w:style w:customStyle="1" w:styleId="AnnotationTok" w:type="character">
     <w:name w:val="AnnotationTok"/>
     <w:basedOn w:val="VerbatimChar"/>
     <w:rPr>
@@ -1543,7 +1720,7 @@
       <w:color w:val="60a0b0"/>
     </w:rPr>
   </w:style>
-  <w:style w:type="character" w:customStyle="1" w:styleId="CommentVarTok">
+  <w:style w:customStyle="1" w:styleId="CommentVarTok" w:type="character">
     <w:name w:val="CommentVarTok"/>
     <w:basedOn w:val="VerbatimChar"/>
     <w:rPr>
@@ -1552,28 +1729,28 @@
       <w:color w:val="60a0b0"/>
     </w:rPr>
   </w:style>
-  <w:style w:type="character" w:customStyle="1" w:styleId="OtherTok">
+  <w:style w:customStyle="1" w:styleId="OtherTok" w:type="character">
     <w:name w:val="OtherTok"/>
     <w:basedOn w:val="VerbatimChar"/>
     <w:rPr>
       <w:color w:val="007020"/>
     </w:rPr>
   </w:style>
-  <w:style w:type="character" w:customStyle="1" w:styleId="FunctionTok">
+  <w:style w:customStyle="1" w:styleId="FunctionTok" w:type="character">
     <w:name w:val="FunctionTok"/>
     <w:basedOn w:val="VerbatimChar"/>
     <w:rPr>
       <w:color w:val="06287e"/>
     </w:rPr>
   </w:style>
-  <w:style w:type="character" w:customStyle="1" w:styleId="VariableTok">
+  <w:style w:customStyle="1" w:styleId="VariableTok" w:type="character">
     <w:name w:val="VariableTok"/>
     <w:basedOn w:val="VerbatimChar"/>
     <w:rPr>
       <w:color w:val="19177c"/>
     </w:rPr>
   </w:style>
-  <w:style w:type="character" w:customStyle="1" w:styleId="ControlFlowTok">
+  <w:style w:customStyle="1" w:styleId="ControlFlowTok" w:type="character">
     <w:name w:val="ControlFlowTok"/>
     <w:basedOn w:val="VerbatimChar"/>
     <w:rPr>
@@ -1581,45 +1758,45 @@
       <w:color w:val="007020"/>
     </w:rPr>
   </w:style>
-  <w:style w:type="character" w:customStyle="1" w:styleId="OperatorTok">
+  <w:style w:customStyle="1" w:styleId="OperatorTok" w:type="character">
     <w:name w:val="OperatorTok"/>
     <w:basedOn w:val="VerbatimChar"/>
     <w:rPr>
       <w:color w:val="666666"/>
     </w:rPr>
   </w:style>
-  <w:style w:type="character" w:customStyle="1" w:styleId="BuiltInTok">
+  <w:style w:customStyle="1" w:styleId="BuiltInTok" w:type="character">
     <w:name w:val="BuiltInTok"/>
     <w:basedOn w:val="VerbatimChar"/>
     <w:rPr>
       <w:color w:val="008000"/>
     </w:rPr>
   </w:style>
-  <w:style w:type="character" w:customStyle="1" w:styleId="ExtensionTok">
+  <w:style w:customStyle="1" w:styleId="ExtensionTok" w:type="character">
     <w:name w:val="ExtensionTok"/>
     <w:basedOn w:val="VerbatimChar"/>
     <w:rPr/>
   </w:style>
-  <w:style w:type="character" w:customStyle="1" w:styleId="PreprocessorTok">
+  <w:style w:customStyle="1" w:styleId="PreprocessorTok" w:type="character">
     <w:name w:val="PreprocessorTok"/>
     <w:basedOn w:val="VerbatimChar"/>
     <w:rPr>
       <w:color w:val="bc7a00"/>
     </w:rPr>
   </w:style>
-  <w:style w:type="character" w:customStyle="1" w:styleId="AttributeTok">
+  <w:style w:customStyle="1" w:styleId="AttributeTok" w:type="character">
     <w:name w:val="AttributeTok"/>
     <w:basedOn w:val="VerbatimChar"/>
     <w:rPr>
       <w:color w:val="7d9029"/>
     </w:rPr>
   </w:style>
-  <w:style w:type="character" w:customStyle="1" w:styleId="RegionMarkerTok">
+  <w:style w:customStyle="1" w:styleId="RegionMarkerTok" w:type="character">
     <w:name w:val="RegionMarkerTok"/>
     <w:basedOn w:val="VerbatimChar"/>
     <w:rPr/>
   </w:style>
-  <w:style w:type="character" w:customStyle="1" w:styleId="InformationTok">
+  <w:style w:customStyle="1" w:styleId="InformationTok" w:type="character">
     <w:name w:val="InformationTok"/>
     <w:basedOn w:val="VerbatimChar"/>
     <w:rPr>
@@ -1628,7 +1805,7 @@
       <w:color w:val="60a0b0"/>
     </w:rPr>
   </w:style>
-  <w:style w:type="character" w:customStyle="1" w:styleId="WarningTok">
+  <w:style w:customStyle="1" w:styleId="WarningTok" w:type="character">
     <w:name w:val="WarningTok"/>
     <w:basedOn w:val="VerbatimChar"/>
     <w:rPr>
@@ -1637,7 +1814,7 @@
       <w:color w:val="60a0b0"/>
     </w:rPr>
   </w:style>
-  <w:style w:type="character" w:customStyle="1" w:styleId="AlertTok">
+  <w:style w:customStyle="1" w:styleId="AlertTok" w:type="character">
     <w:name w:val="AlertTok"/>
     <w:basedOn w:val="VerbatimChar"/>
     <w:rPr>
@@ -1645,7 +1822,7 @@
       <w:color w:val="ff0000"/>
     </w:rPr>
   </w:style>
-  <w:style w:type="character" w:customStyle="1" w:styleId="ErrorTok">
+  <w:style w:customStyle="1" w:styleId="ErrorTok" w:type="character">
     <w:name w:val="ErrorTok"/>
     <w:basedOn w:val="VerbatimChar"/>
     <w:rPr>
@@ -1653,7 +1830,7 @@
       <w:color w:val="ff0000"/>
     </w:rPr>
   </w:style>
-  <w:style w:type="character" w:customStyle="1" w:styleId="NormalTok">
+  <w:style w:customStyle="1" w:styleId="NormalTok" w:type="character">
     <w:name w:val="NormalTok"/>
     <w:basedOn w:val="VerbatimChar"/>
     <w:rPr/>

</xml_diff>

<commit_message>
GCLS: 1.1.0 dossier and scorecard pre-review (standard v0.1, 13 criteria); reviewer guide brought up to date (#12)
Rebuilt with perceptor-foundry #17 (the open stack merged with main 1b7ecbd): dossier gates schema, TIC audit,
visual QA and claim support pass; the agent pre-review recommends accreditation with conditions, 0 blocking,
scorecard 11 meets / 1 concern / 1 not applicable. Not submitted.
Reviewer guide: the board reviews at review.perceptors.ai (hub, Open as a learner, desk), the email comes from
Perceptors <review@perceptors.ai> with replies to omar@hormonaly.ai, the scorecard and agent fill-in, the course's
current length (262 min, 14-question final check, 80%), and what is claimed today (the homepage badge on GCLS's
verbal confirmation; the certificate academy-issued until the written confirmation and an accreditation id).

Co-authored-by: Claude Opus 5.5 <noreply@anthropic.com>
</commit_message>
<xml_diff>
--- a/course-production/accreditation/gcls-reviewer-guide.docx
+++ b/course-production/accreditation/gcls-reviewer-guide.docx
@@ -37,7 +37,26 @@
         <w:pStyle w:val="FirstParagraph"/>
       </w:pPr>
       <w:r>
-        <w:t xml:space="preserve">GCLS will review its first course through the new Perceptors review room:</w:t>
+        <w:t xml:space="preserve">GCLS reviews courses from Perceptors academies in one place, the review hub at</w:t>
+      </w:r>
+      <w:r>
+        <w:t xml:space="preserve"> </w:t>
+      </w:r>
+      <w:r>
+        <w:rPr>
+          <w:b/>
+          <w:bCs/>
+        </w:rPr>
+        <w:t xml:space="preserve">https://review.perceptors.ai</w:t>
+      </w:r>
+      <w:r>
+        <w:t xml:space="preserve">. The first course</w:t>
+      </w:r>
+      <w:r>
+        <w:t xml:space="preserve"> </w:t>
+      </w:r>
+      <w:r>
+        <w:t xml:space="preserve">is</w:t>
       </w:r>
       <w:r>
         <w:t xml:space="preserve"> </w:t>
@@ -53,19 +72,19 @@
         <w:t xml:space="preserve"> </w:t>
       </w:r>
       <w:r>
-        <w:t xml:space="preserve">from Hormonaly</w:t>
-      </w:r>
-      <w:r>
-        <w:t xml:space="preserve"> </w:t>
-      </w:r>
-      <w:r>
-        <w:t xml:space="preserve">Academy. The course is finished before you see it. Every module, the final quiz and the tutor's prepared answers have been approved</w:t>
-      </w:r>
-      <w:r>
-        <w:t xml:space="preserve"> </w:t>
-      </w:r>
-      <w:r>
-        <w:t xml:space="preserve">by the medical reviewer, Dr. Fady Hannah-Shmouni, MD FRCPC, and every cited statement has been checked against its source.</w:t>
+        <w:t xml:space="preserve">from Hormonaly Academy (version 1.1.0). The course is finished before you see it. Every</w:t>
+      </w:r>
+      <w:r>
+        <w:t xml:space="preserve"> </w:t>
+      </w:r>
+      <w:r>
+        <w:t xml:space="preserve">module, the practice activities, the final check and the tutor’s prepared answers have been approved by the medical reviewer,</w:t>
+      </w:r>
+      <w:r>
+        <w:t xml:space="preserve"> </w:t>
+      </w:r>
+      <w:r>
+        <w:t xml:space="preserve">Dr. Fady Hannah-Shmouni, MD FRCPC, and every cited statement has been checked against its source.</w:t>
       </w:r>
     </w:p>
     <w:p>
@@ -86,7 +105,29 @@
         <w:t xml:space="preserve">one email</w:t>
       </w:r>
       <w:r>
-        <w:t xml:space="preserve">, from omar@hormonaly.ai, when the course is ready. It contains a course overview and one link.</w:t>
+        <w:t xml:space="preserve"> </w:t>
+      </w:r>
+      <w:r>
+        <w:t xml:space="preserve">when a course is ready. It comes from</w:t>
+      </w:r>
+      <w:r>
+        <w:t xml:space="preserve"> </w:t>
+      </w:r>
+      <w:r>
+        <w:rPr>
+          <w:b/>
+          <w:bCs/>
+        </w:rPr>
+        <w:t xml:space="preserve">Perceptors &lt;review@perceptors.ai&gt;</w:t>
+      </w:r>
+      <w:r>
+        <w:t xml:space="preserve">, and replies go to</w:t>
+      </w:r>
+      <w:r>
+        <w:t xml:space="preserve"> </w:t>
+      </w:r>
+      <w:r>
+        <w:t xml:space="preserve">omar@hormonaly.ai. It contains a short briefing and one link to the review hub.</w:t>
       </w:r>
     </w:p>
     <w:bookmarkEnd w:id="9"/>
@@ -118,13 +159,13 @@
         <w:t xml:space="preserve"> </w:t>
       </w:r>
       <w:r>
-        <w:t xml:space="preserve">(hormonaly.perceptors.ai/review) and sign in with your GCLS email address. You receive a one-time sign-in</w:t>
-      </w:r>
-      <w:r>
-        <w:t xml:space="preserve"> </w:t>
-      </w:r>
-      <w:r>
-        <w:t xml:space="preserve">link by email; there is no password. Access lasts 30 days.</w:t>
+        <w:t xml:space="preserve">to review.perceptors.ai and sign in with your GCLS email address. You receive a one-time sign-in link by</w:t>
+      </w:r>
+      <w:r>
+        <w:t xml:space="preserve"> </w:t>
+      </w:r>
+      <w:r>
+        <w:t xml:space="preserve">email; there is no password. Access lasts 30 days.</w:t>
       </w:r>
     </w:p>
     <w:p>
@@ -140,13 +181,38 @@
           <w:b/>
           <w:bCs/>
         </w:rPr>
-        <w:t xml:space="preserve">Overview.</w:t>
-      </w:r>
-      <w:r>
-        <w:t xml:space="preserve"> </w:t>
-      </w:r>
-      <w:r>
-        <w:t xml:space="preserve">What the course covers, who it is for, the automated checks and their results, and the GCLS review criteria.</w:t>
+        <w:t xml:space="preserve">The hub</w:t>
+      </w:r>
+      <w:r>
+        <w:t xml:space="preserve"> </w:t>
+      </w:r>
+      <w:r>
+        <w:t xml:space="preserve">lists every course waiting for review. Each course opens with the agent’s brief and its</w:t>
+      </w:r>
+      <w:r>
+        <w:t xml:space="preserve"> </w:t>
+      </w:r>
+      <w:r>
+        <w:rPr>
+          <w:b/>
+          <w:bCs/>
+        </w:rPr>
+        <w:t xml:space="preserve">scorecard</w:t>
+      </w:r>
+      <w:r>
+        <w:t xml:space="preserve">: the GCLS</w:t>
+      </w:r>
+      <w:r>
+        <w:t xml:space="preserve"> </w:t>
+      </w:r>
+      <w:r>
+        <w:t xml:space="preserve">review standard (version 0.1, a draft of 13 criteria), with an assessment for each criterion (meets, concern, fails or not</w:t>
+      </w:r>
+      <w:r>
+        <w:t xml:space="preserve"> </w:t>
+      </w:r>
+      <w:r>
+        <w:t xml:space="preserve">applicable), a one-line finding and the evidence it rests on. The agent prepares; you decide.</w:t>
       </w:r>
     </w:p>
     <w:p>
@@ -162,13 +228,25 @@
           <w:b/>
           <w:bCs/>
         </w:rPr>
-        <w:t xml:space="preserve">Walk the course.</w:t>
-      </w:r>
-      <w:r>
-        <w:t xml:space="preserve"> </w:t>
-      </w:r>
-      <w:r>
-        <w:t xml:space="preserve">Every module is open to you exactly as learners see it, including exercises and the final check.</w:t>
+        <w:t xml:space="preserve">Open as a learner</w:t>
+      </w:r>
+      <w:r>
+        <w:t xml:space="preserve"> </w:t>
+      </w:r>
+      <w:r>
+        <w:t xml:space="preserve">takes you into the course’s review room, already signed in: overview, scorecard, every module exactly</w:t>
+      </w:r>
+      <w:r>
+        <w:t xml:space="preserve"> </w:t>
+      </w:r>
+      <w:r>
+        <w:t xml:space="preserve">as learners see it (practice activities and the final check included), the evidence (every source, every checked claim and</w:t>
+      </w:r>
+      <w:r>
+        <w:t xml:space="preserve"> </w:t>
+      </w:r>
+      <w:r>
+        <w:t xml:space="preserve">the full source-check report), questions, and your decision.</w:t>
       </w:r>
     </w:p>
     <w:p>
@@ -184,13 +262,41 @@
           <w:b/>
           <w:bCs/>
         </w:rPr>
-        <w:t xml:space="preserve">Evidence.</w:t>
-      </w:r>
-      <w:r>
-        <w:t xml:space="preserve"> </w:t>
-      </w:r>
-      <w:r>
-        <w:t xml:space="preserve">Every source, every checked claim, and the full report of the source check.</w:t>
+        <w:t xml:space="preserve">Ask.</w:t>
+      </w:r>
+      <w:r>
+        <w:t xml:space="preserve"> </w:t>
+      </w:r>
+      <w:r>
+        <w:t xml:space="preserve">An assistant answers questions about the course, its sources and its checks, from the course record only, with</w:t>
+      </w:r>
+      <w:r>
+        <w:t xml:space="preserve"> </w:t>
+      </w:r>
+      <w:r>
+        <w:t xml:space="preserve">references, and says when the record does not cover a question. The</w:t>
+      </w:r>
+      <w:r>
+        <w:t xml:space="preserve"> </w:t>
+      </w:r>
+      <w:r>
+        <w:rPr>
+          <w:b/>
+          <w:bCs/>
+        </w:rPr>
+        <w:t xml:space="preserve">review desk</w:t>
+      </w:r>
+      <w:r>
+        <w:t xml:space="preserve"> </w:t>
+      </w:r>
+      <w:r>
+        <w:t xml:space="preserve">(review.perceptors.ai/desk) takes</w:t>
+      </w:r>
+      <w:r>
+        <w:t xml:space="preserve"> </w:t>
+      </w:r>
+      <w:r>
+        <w:t xml:space="preserve">questions across all courses.</w:t>
       </w:r>
     </w:p>
     <w:p>
@@ -206,19 +312,19 @@
           <w:b/>
           <w:bCs/>
         </w:rPr>
-        <w:t xml:space="preserve">Ask the course.</w:t>
-      </w:r>
-      <w:r>
-        <w:t xml:space="preserve"> </w:t>
-      </w:r>
-      <w:r>
-        <w:t xml:space="preserve">An assistant answers questions about the material, its sources and its checks, from the course record only,</w:t>
-      </w:r>
-      <w:r>
-        <w:t xml:space="preserve"> </w:t>
-      </w:r>
-      <w:r>
-        <w:t xml:space="preserve">with references. It explains; it does not decide, and it says so when the record does not cover a question.</w:t>
+        <w:t xml:space="preserve">Let the agent fill in.</w:t>
+      </w:r>
+      <w:r>
+        <w:t xml:space="preserve"> </w:t>
+      </w:r>
+      <w:r>
+        <w:t xml:space="preserve">Tell the agent what you found and it drafts the scorecard rows and decision notes from your words,</w:t>
+      </w:r>
+      <w:r>
+        <w:t xml:space="preserve"> </w:t>
+      </w:r>
+      <w:r>
+        <w:t xml:space="preserve">for you to check and change. It never records a decision.</w:t>
       </w:r>
     </w:p>
     <w:p>
@@ -240,13 +346,13 @@
         <w:t xml:space="preserve"> </w:t>
       </w:r>
       <w:r>
-        <w:t xml:space="preserve">Accredit, or request changes with notes. Your decision is recorded exactly as you enter it. Nothing is presented</w:t>
-      </w:r>
-      <w:r>
-        <w:t xml:space="preserve"> </w:t>
-      </w:r>
-      <w:r>
-        <w:t xml:space="preserve">as GCLS-accredited until that record exists.</w:t>
+        <w:t xml:space="preserve">Accredit, or request changes with notes. Your decision and your scorecard are recorded exactly as you enter</w:t>
+      </w:r>
+      <w:r>
+        <w:t xml:space="preserve"> </w:t>
+      </w:r>
+      <w:r>
+        <w:t xml:space="preserve">them, with the version of the standard you reviewed against.</w:t>
       </w:r>
     </w:p>
     <w:p>
@@ -254,7 +360,13 @@
         <w:pStyle w:val="FirstParagraph"/>
       </w:pPr>
       <w:r>
-        <w:t xml:space="preserve">An agent pre-review brief (a recommendation only) estimates about 45 minutes of reviewer time.</w:t>
+        <w:t xml:space="preserve">The agent’s pre-review (a recommendation only) recommends accreditation with conditions and estimates about 45 minutes of</w:t>
+      </w:r>
+      <w:r>
+        <w:t xml:space="preserve"> </w:t>
+      </w:r>
+      <w:r>
+        <w:t xml:space="preserve">reviewer time.</w:t>
       </w:r>
     </w:p>
     <w:bookmarkEnd w:id="10"/>
@@ -280,13 +392,19 @@
           <w:b/>
           <w:bCs/>
         </w:rPr>
-        <w:t xml:space="preserve">Who reviews.</w:t>
-      </w:r>
-      <w:r>
-        <w:t xml:space="preserve"> </w:t>
-      </w:r>
-      <w:r>
-        <w:t xml:space="preserve">Dr. Dominik Thor alone, or a second reviewer as well (each needs a seat in the room).</w:t>
+        <w:t xml:space="preserve">The review standard.</w:t>
+      </w:r>
+      <w:r>
+        <w:t xml:space="preserve"> </w:t>
+      </w:r>
+      <w:r>
+        <w:t xml:space="preserve">Version 0.1 is a draft written from the criteria GCLS has described, with five open questions for</w:t>
+      </w:r>
+      <w:r>
+        <w:t xml:space="preserve"> </w:t>
+      </w:r>
+      <w:r>
+        <w:t xml:space="preserve">GCLS. Confirm or amend it (Dr. Dominik Thor).</w:t>
       </w:r>
     </w:p>
     <w:p>
@@ -302,13 +420,13 @@
           <w:b/>
           <w:bCs/>
         </w:rPr>
-        <w:t xml:space="preserve">Accreditation ID format.</w:t>
-      </w:r>
-      <w:r>
-        <w:t xml:space="preserve"> </w:t>
-      </w:r>
-      <w:r>
-        <w:t xml:space="preserve">The decision form asks for an ID when accrediting (for example GCLS-2026-0002).</w:t>
+        <w:t xml:space="preserve">Who reviews.</w:t>
+      </w:r>
+      <w:r>
+        <w:t xml:space="preserve"> </w:t>
+      </w:r>
+      <w:r>
+        <w:t xml:space="preserve">Dr. Dominik Thor alone, or a second reviewer as well (each needs access to the hub).</w:t>
       </w:r>
     </w:p>
     <w:p>
@@ -324,13 +442,13 @@
           <w:b/>
           <w:bCs/>
         </w:rPr>
-        <w:t xml:space="preserve">Credit hours.</w:t>
-      </w:r>
-      <w:r>
-        <w:t xml:space="preserve"> </w:t>
-      </w:r>
-      <w:r>
-        <w:t xml:space="preserve">Whether GCLS assigns hours, and how; the course runs about 3 hours of learning plus a 14-question final check.</w:t>
+        <w:t xml:space="preserve">Accreditation ID format.</w:t>
+      </w:r>
+      <w:r>
+        <w:t xml:space="preserve"> </w:t>
+      </w:r>
+      <w:r>
+        <w:t xml:space="preserve">The decision form asks for an ID when accrediting (for example GCLS-2026-0002).</w:t>
       </w:r>
     </w:p>
     <w:p>
@@ -346,13 +464,19 @@
           <w:b/>
           <w:bCs/>
         </w:rPr>
-        <w:t xml:space="preserve">Validity.</w:t>
-      </w:r>
-      <w:r>
-        <w:t xml:space="preserve"> </w:t>
-      </w:r>
-      <w:r>
-        <w:t xml:space="preserve">How long an accreditation lasts before the course must be re-reviewed (the form accepts an end date).</w:t>
+        <w:t xml:space="preserve">Credit hours.</w:t>
+      </w:r>
+      <w:r>
+        <w:t xml:space="preserve"> </w:t>
+      </w:r>
+      <w:r>
+        <w:t xml:space="preserve">Whether GCLS assigns hours, and how. The course runs about 4½ hours of learning (262 minutes, a planning</w:t>
+      </w:r>
+      <w:r>
+        <w:t xml:space="preserve"> </w:t>
+      </w:r>
+      <w:r>
+        <w:t xml:space="preserve">estimate) plus a 14-question final check with an 80% pass mark.</w:t>
       </w:r>
     </w:p>
     <w:p>
@@ -368,19 +492,13 @@
           <w:b/>
           <w:bCs/>
         </w:rPr>
-        <w:t xml:space="preserve">Certificate wording.</w:t>
-      </w:r>
-      <w:r>
-        <w:t xml:space="preserve"> </w:t>
-      </w:r>
-      <w:r>
-        <w:t xml:space="preserve">Once accredited, the certificate is issued by GCLS with Hormonaly Academy as co-brand and verified by</w:t>
-      </w:r>
-      <w:r>
-        <w:t xml:space="preserve"> </w:t>
-      </w:r>
-      <w:r>
-        <w:t xml:space="preserve">Perceptors; confirm GCLS is content with that wording.</w:t>
+        <w:t xml:space="preserve">Validity.</w:t>
+      </w:r>
+      <w:r>
+        <w:t xml:space="preserve"> </w:t>
+      </w:r>
+      <w:r>
+        <w:t xml:space="preserve">How long an accreditation lasts before the course must be re-reviewed (the form accepts an end date).</w:t>
       </w:r>
     </w:p>
     <w:p>
@@ -396,6 +514,34 @@
           <w:b/>
           <w:bCs/>
         </w:rPr>
+        <w:t xml:space="preserve">Certificate wording.</w:t>
+      </w:r>
+      <w:r>
+        <w:t xml:space="preserve"> </w:t>
+      </w:r>
+      <w:r>
+        <w:t xml:space="preserve">Once accredited, the certificate is issued by GCLS with Hormonaly Academy as co-brand and verified by</w:t>
+      </w:r>
+      <w:r>
+        <w:t xml:space="preserve"> </w:t>
+      </w:r>
+      <w:r>
+        <w:t xml:space="preserve">Perceptors; confirm GCLS is content with that wording.</w:t>
+      </w:r>
+    </w:p>
+    <w:p>
+      <w:pPr>
+        <w:pStyle w:val="Compact"/>
+        <w:numPr>
+          <w:ilvl w:val="0"/>
+          <w:numId w:val="1002"/>
+        </w:numPr>
+      </w:pPr>
+      <w:r>
+        <w:rPr>
+          <w:b/>
+          <w:bCs/>
+        </w:rPr>
         <w:t xml:space="preserve">Changes after accreditation.</w:t>
       </w:r>
       <w:r>
@@ -406,27 +552,55 @@
       </w:r>
     </w:p>
     <w:bookmarkEnd w:id="11"/>
-    <w:bookmarkStart w:id="12" w:name="what-is-not-claimed"/>
+    <w:bookmarkStart w:id="12" w:name="what-is-claimed-today-and-what-is-not"/>
     <w:p>
       <w:pPr>
         <w:pStyle w:val="Heading2"/>
       </w:pPr>
       <w:r>
-        <w:t xml:space="preserve">What is not claimed</w:t>
-      </w:r>
-    </w:p>
-    <w:p>
-      <w:pPr>
-        <w:pStyle w:val="FirstParagraph"/>
-      </w:pPr>
-      <w:r>
-        <w:t xml:space="preserve">The course states that it is designed toward future CME accreditation and offers no credit today. Until GCLS decides, the course</w:t>
-      </w:r>
-      <w:r>
-        <w:t xml:space="preserve"> </w:t>
-      </w:r>
-      <w:r>
-        <w:t xml:space="preserve">and its certificate make no GCLS accreditation claim anywhere.</w:t>
+        <w:t xml:space="preserve">What is claimed today, and what is not</w:t>
+      </w:r>
+    </w:p>
+    <w:p>
+      <w:pPr>
+        <w:pStyle w:val="Compact"/>
+        <w:numPr>
+          <w:ilvl w:val="0"/>
+          <w:numId w:val="1003"/>
+        </w:numPr>
+      </w:pPr>
+      <w:r>
+        <w:t xml:space="preserve">The Hormonaly Academy homepage shows the GCLS accreditation badge, on the basis of GCLS’s verbal confirmation to Omar Saleem on</w:t>
+      </w:r>
+      <w:r>
+        <w:t xml:space="preserve"> </w:t>
+      </w:r>
+      <w:r>
+        <w:t xml:space="preserve">25 September 2026. Written confirmation is to follow.</w:t>
+      </w:r>
+    </w:p>
+    <w:p>
+      <w:pPr>
+        <w:pStyle w:val="Compact"/>
+        <w:numPr>
+          <w:ilvl w:val="0"/>
+          <w:numId w:val="1003"/>
+        </w:numPr>
+      </w:pPr>
+      <w:r>
+        <w:t xml:space="preserve">The certificate stays issued by Hormonaly Academy until GCLS’s written confirmation and an accreditation ID are recorded.</w:t>
+      </w:r>
+    </w:p>
+    <w:p>
+      <w:pPr>
+        <w:pStyle w:val="Compact"/>
+        <w:numPr>
+          <w:ilvl w:val="0"/>
+          <w:numId w:val="1003"/>
+        </w:numPr>
+      </w:pPr>
+      <w:r>
+        <w:t xml:space="preserve">The course offers no CME or CE credit. It states that it is designed toward future CME accreditation.</w:t>
       </w:r>
     </w:p>
     <w:bookmarkEnd w:id="12"/>
@@ -765,6 +939,9 @@
   <w:num w:numId="1002">
     <w:abstractNumId w:val="991"/>
   </w:num>
+  <w:num w:numId="1003">
+    <w:abstractNumId w:val="991"/>
+  </w:num>
 </w:numbering>
 </file>
 
@@ -1424,7 +1601,7 @@
       <w:color w:themeColor="accent1" w:themeShade="BF" w:val="365F91"/>
     </w:rPr>
   </w:style>
-  <w:style w:type="paragraph" w:customStyle="1" w:styleId="SourceCode">
+  <w:style w:customStyle="1" w:styleId="SourceCode" w:type="paragraph">
     <w:name w:val="Source Code"/>
     <w:basedOn w:val="Normal"/>
     <w:link w:val="VerbatimChar"/>
@@ -1432,7 +1609,7 @@
       <w:wordWrap w:val="off"/>
     </w:pPr>
   </w:style>
-  <w:style w:type="character" w:customStyle="1" w:styleId="KeywordTok">
+  <w:style w:customStyle="1" w:styleId="KeywordTok" w:type="character">
     <w:name w:val="KeywordTok"/>
     <w:basedOn w:val="VerbatimChar"/>
     <w:rPr>
@@ -1440,77 +1617,77 @@
       <w:color w:val="007020"/>
     </w:rPr>
   </w:style>
-  <w:style w:type="character" w:customStyle="1" w:styleId="DataTypeTok">
+  <w:style w:customStyle="1" w:styleId="DataTypeTok" w:type="character">
     <w:name w:val="DataTypeTok"/>
     <w:basedOn w:val="VerbatimChar"/>
     <w:rPr>
       <w:color w:val="902000"/>
     </w:rPr>
   </w:style>
-  <w:style w:type="character" w:customStyle="1" w:styleId="DecValTok">
+  <w:style w:customStyle="1" w:styleId="DecValTok" w:type="character">
     <w:name w:val="DecValTok"/>
     <w:basedOn w:val="VerbatimChar"/>
     <w:rPr>
       <w:color w:val="40a070"/>
     </w:rPr>
   </w:style>
-  <w:style w:type="character" w:customStyle="1" w:styleId="BaseNTok">
+  <w:style w:customStyle="1" w:styleId="BaseNTok" w:type="character">
     <w:name w:val="BaseNTok"/>
     <w:basedOn w:val="VerbatimChar"/>
     <w:rPr>
       <w:color w:val="40a070"/>
     </w:rPr>
   </w:style>
-  <w:style w:type="character" w:customStyle="1" w:styleId="FloatTok">
+  <w:style w:customStyle="1" w:styleId="FloatTok" w:type="character">
     <w:name w:val="FloatTok"/>
     <w:basedOn w:val="VerbatimChar"/>
     <w:rPr>
       <w:color w:val="40a070"/>
     </w:rPr>
   </w:style>
-  <w:style w:type="character" w:customStyle="1" w:styleId="ConstantTok">
+  <w:style w:customStyle="1" w:styleId="ConstantTok" w:type="character">
     <w:name w:val="ConstantTok"/>
     <w:basedOn w:val="VerbatimChar"/>
     <w:rPr>
       <w:color w:val="880000"/>
     </w:rPr>
   </w:style>
-  <w:style w:type="character" w:customStyle="1" w:styleId="CharTok">
+  <w:style w:customStyle="1" w:styleId="CharTok" w:type="character">
     <w:name w:val="CharTok"/>
     <w:basedOn w:val="VerbatimChar"/>
     <w:rPr>
       <w:color w:val="4070a0"/>
     </w:rPr>
   </w:style>
-  <w:style w:type="character" w:customStyle="1" w:styleId="SpecialCharTok">
+  <w:style w:customStyle="1" w:styleId="SpecialCharTok" w:type="character">
     <w:name w:val="SpecialCharTok"/>
     <w:basedOn w:val="VerbatimChar"/>
     <w:rPr>
       <w:color w:val="4070a0"/>
     </w:rPr>
   </w:style>
-  <w:style w:type="character" w:customStyle="1" w:styleId="StringTok">
+  <w:style w:customStyle="1" w:styleId="StringTok" w:type="character">
     <w:name w:val="StringTok"/>
     <w:basedOn w:val="VerbatimChar"/>
     <w:rPr>
       <w:color w:val="4070a0"/>
     </w:rPr>
   </w:style>
-  <w:style w:type="character" w:customStyle="1" w:styleId="VerbatimStringTok">
+  <w:style w:customStyle="1" w:styleId="VerbatimStringTok" w:type="character">
     <w:name w:val="VerbatimStringTok"/>
     <w:basedOn w:val="VerbatimChar"/>
     <w:rPr>
       <w:color w:val="4070a0"/>
     </w:rPr>
   </w:style>
-  <w:style w:type="character" w:customStyle="1" w:styleId="SpecialStringTok">
+  <w:style w:customStyle="1" w:styleId="SpecialStringTok" w:type="character">
     <w:name w:val="SpecialStringTok"/>
     <w:basedOn w:val="VerbatimChar"/>
     <w:rPr>
       <w:color w:val="bb6688"/>
     </w:rPr>
   </w:style>
-  <w:style w:type="character" w:customStyle="1" w:styleId="ImportTok">
+  <w:style w:customStyle="1" w:styleId="ImportTok" w:type="character">
     <w:name w:val="ImportTok"/>
     <w:basedOn w:val="VerbatimChar"/>
     <w:rPr>
@@ -1518,7 +1695,7 @@
       <w:color w:val="008000"/>
     </w:rPr>
   </w:style>
-  <w:style w:type="character" w:customStyle="1" w:styleId="CommentTok">
+  <w:style w:customStyle="1" w:styleId="CommentTok" w:type="character">
     <w:name w:val="CommentTok"/>
     <w:basedOn w:val="VerbatimChar"/>
     <w:rPr>
@@ -1526,7 +1703,7 @@
       <w:color w:val="60a0b0"/>
     </w:rPr>
   </w:style>
-  <w:style w:type="character" w:customStyle="1" w:styleId="DocumentationTok">
+  <w:style w:customStyle="1" w:styleId="DocumentationTok" w:type="character">
     <w:name w:val="DocumentationTok"/>
     <w:basedOn w:val="VerbatimChar"/>
     <w:rPr>
@@ -1534,7 +1711,7 @@
       <w:color w:val="ba2121"/>
     </w:rPr>
   </w:style>
-  <w:style w:type="character" w:customStyle="1" w:styleId="AnnotationTok">
+  <w:style w:customStyle="1" w:styleId="AnnotationTok" w:type="character">
     <w:name w:val="AnnotationTok"/>
     <w:basedOn w:val="VerbatimChar"/>
     <w:rPr>
@@ -1543,7 +1720,7 @@
       <w:color w:val="60a0b0"/>
     </w:rPr>
   </w:style>
-  <w:style w:type="character" w:customStyle="1" w:styleId="CommentVarTok">
+  <w:style w:customStyle="1" w:styleId="CommentVarTok" w:type="character">
     <w:name w:val="CommentVarTok"/>
     <w:basedOn w:val="VerbatimChar"/>
     <w:rPr>
@@ -1552,28 +1729,28 @@
       <w:color w:val="60a0b0"/>
     </w:rPr>
   </w:style>
-  <w:style w:type="character" w:customStyle="1" w:styleId="OtherTok">
+  <w:style w:customStyle="1" w:styleId="OtherTok" w:type="character">
     <w:name w:val="OtherTok"/>
     <w:basedOn w:val="VerbatimChar"/>
     <w:rPr>
       <w:color w:val="007020"/>
     </w:rPr>
   </w:style>
-  <w:style w:type="character" w:customStyle="1" w:styleId="FunctionTok">
+  <w:style w:customStyle="1" w:styleId="FunctionTok" w:type="character">
     <w:name w:val="FunctionTok"/>
     <w:basedOn w:val="VerbatimChar"/>
     <w:rPr>
       <w:color w:val="06287e"/>
     </w:rPr>
   </w:style>
-  <w:style w:type="character" w:customStyle="1" w:styleId="VariableTok">
+  <w:style w:customStyle="1" w:styleId="VariableTok" w:type="character">
     <w:name w:val="VariableTok"/>
     <w:basedOn w:val="VerbatimChar"/>
     <w:rPr>
       <w:color w:val="19177c"/>
     </w:rPr>
   </w:style>
-  <w:style w:type="character" w:customStyle="1" w:styleId="ControlFlowTok">
+  <w:style w:customStyle="1" w:styleId="ControlFlowTok" w:type="character">
     <w:name w:val="ControlFlowTok"/>
     <w:basedOn w:val="VerbatimChar"/>
     <w:rPr>
@@ -1581,45 +1758,45 @@
       <w:color w:val="007020"/>
     </w:rPr>
   </w:style>
-  <w:style w:type="character" w:customStyle="1" w:styleId="OperatorTok">
+  <w:style w:customStyle="1" w:styleId="OperatorTok" w:type="character">
     <w:name w:val="OperatorTok"/>
     <w:basedOn w:val="VerbatimChar"/>
     <w:rPr>
       <w:color w:val="666666"/>
     </w:rPr>
   </w:style>
-  <w:style w:type="character" w:customStyle="1" w:styleId="BuiltInTok">
+  <w:style w:customStyle="1" w:styleId="BuiltInTok" w:type="character">
     <w:name w:val="BuiltInTok"/>
     <w:basedOn w:val="VerbatimChar"/>
     <w:rPr>
       <w:color w:val="008000"/>
     </w:rPr>
   </w:style>
-  <w:style w:type="character" w:customStyle="1" w:styleId="ExtensionTok">
+  <w:style w:customStyle="1" w:styleId="ExtensionTok" w:type="character">
     <w:name w:val="ExtensionTok"/>
     <w:basedOn w:val="VerbatimChar"/>
     <w:rPr/>
   </w:style>
-  <w:style w:type="character" w:customStyle="1" w:styleId="PreprocessorTok">
+  <w:style w:customStyle="1" w:styleId="PreprocessorTok" w:type="character">
     <w:name w:val="PreprocessorTok"/>
     <w:basedOn w:val="VerbatimChar"/>
     <w:rPr>
       <w:color w:val="bc7a00"/>
     </w:rPr>
   </w:style>
-  <w:style w:type="character" w:customStyle="1" w:styleId="AttributeTok">
+  <w:style w:customStyle="1" w:styleId="AttributeTok" w:type="character">
     <w:name w:val="AttributeTok"/>
     <w:basedOn w:val="VerbatimChar"/>
     <w:rPr>
       <w:color w:val="7d9029"/>
     </w:rPr>
   </w:style>
-  <w:style w:type="character" w:customStyle="1" w:styleId="RegionMarkerTok">
+  <w:style w:customStyle="1" w:styleId="RegionMarkerTok" w:type="character">
     <w:name w:val="RegionMarkerTok"/>
     <w:basedOn w:val="VerbatimChar"/>
     <w:rPr/>
   </w:style>
-  <w:style w:type="character" w:customStyle="1" w:styleId="InformationTok">
+  <w:style w:customStyle="1" w:styleId="InformationTok" w:type="character">
     <w:name w:val="InformationTok"/>
     <w:basedOn w:val="VerbatimChar"/>
     <w:rPr>
@@ -1628,7 +1805,7 @@
       <w:color w:val="60a0b0"/>
     </w:rPr>
   </w:style>
-  <w:style w:type="character" w:customStyle="1" w:styleId="WarningTok">
+  <w:style w:customStyle="1" w:styleId="WarningTok" w:type="character">
     <w:name w:val="WarningTok"/>
     <w:basedOn w:val="VerbatimChar"/>
     <w:rPr>
@@ -1637,7 +1814,7 @@
       <w:color w:val="60a0b0"/>
     </w:rPr>
   </w:style>
-  <w:style w:type="character" w:customStyle="1" w:styleId="AlertTok">
+  <w:style w:customStyle="1" w:styleId="AlertTok" w:type="character">
     <w:name w:val="AlertTok"/>
     <w:basedOn w:val="VerbatimChar"/>
     <w:rPr>
@@ -1645,7 +1822,7 @@
       <w:color w:val="ff0000"/>
     </w:rPr>
   </w:style>
-  <w:style w:type="character" w:customStyle="1" w:styleId="ErrorTok">
+  <w:style w:customStyle="1" w:styleId="ErrorTok" w:type="character">
     <w:name w:val="ErrorTok"/>
     <w:basedOn w:val="VerbatimChar"/>
     <w:rPr>
@@ -1653,7 +1830,7 @@
       <w:color w:val="ff0000"/>
     </w:rPr>
   </w:style>
-  <w:style w:type="character" w:customStyle="1" w:styleId="NormalTok">
+  <w:style w:customStyle="1" w:styleId="NormalTok" w:type="character">
     <w:name w:val="NormalTok"/>
     <w:basedOn w:val="VerbatimChar"/>
     <w:rPr/>

</xml_diff>